<commit_message>
Set paper author affiliation to 'Independent Researcher'; rebuild PDF/DOCX
Standard arXiv convention for an unaffiliated author. Contact email left as the
remaining title-page placeholder (a publication/privacy choice for the author).
</commit_message>
<xml_diff>
--- a/paper/main.docx
+++ b/paper/main.docx
@@ -21,13 +21,7 @@
     </w:p>
     <w:p>
       <w:r>
-        <w:rPr>
-          <w:i/>
-        </w:rPr>
-        <w:t>[TODO: affiliation]</w:t>
-      </w:r>
-      <w:r>
-        <w:t xml:space="preserve"> · </w:t>
+        <w:t xml:space="preserve">Independent Researcher · </w:t>
       </w:r>
       <w:r>
         <w:rPr>

</xml_diff>

<commit_message>
Rebuild preprint PDF + DOCX from updated content
Sync paper/main.tex to the Markdown source (density-packing as the headline
lever; budget-safety experiment in place of the removed explore section; the
"genuine compromise" section relabeled as user-instructed read-then-exfil, not
injection; Table 1 replaced with the dense-vs-wide ablation; Related Work
corrected re Go-Explore + baseline citation; density caveats and the scoring
disclosure added). Rebuild main.pdf (10 pp, refs resolved) and main.docx
(regenerated from main.md).

Co-Authored-By: Claude Opus 4.8 <noreply@anthropic.com>
Claude-Session: https://claude.ai/code/session_01GUT6EFqSKaGVzFfSkuuENX
</commit_message>
<xml_diff>
--- a/paper/main.docx
+++ b/paper/main.docx
@@ -71,7 +71,25 @@
         <w:t>AI Agent Security — Multi-Step Tool Attacks</w:t>
       </w:r>
       <w:r>
-        <w:t xml:space="preserve"> makes such failures measurable by replaying attacker-supplied message chains against sandboxed tool-using agents and scoring four security predicates. We take an incentive-first view: rather than treating the benchmark as a black box, we reverse-engineer its scoring from the public SDK and ask what behaviour it actually rewards. Three properties dominate: severity stacks within a trace, cell diversity is essentially free, and — because attack generation and evaluator replay share the same guardrail — an attacker can </w:t>
+        <w:t xml:space="preserve"> makes such failures measurable by replaying attacker-supplied message chains against sandboxed tool-using agents and scoring four security predicates. We take an incentive-first view: rather than treating the benchmark as a black box, we reverse-engineer its scoring from the public SDK and ask what behaviour it actually rewards. Three properties dominate: severity stacks </w:t>
+      </w:r>
+      <w:r>
+        <w:rPr>
+          <w:i/>
+        </w:rPr>
+        <w:t>per tool event</w:t>
+      </w:r>
+      <w:r>
+        <w:t xml:space="preserve"> while the evaluator rebuilds the environment </w:t>
+      </w:r>
+      <w:r>
+        <w:rPr>
+          <w:i/>
+        </w:rPr>
+        <w:t>per candidate</w:t>
+      </w:r>
+      <w:r>
+        <w:t xml:space="preserve">; cell diversity is essentially free; and — because attack generation and evaluator replay share the same guardrail — an attacker can </w:t>
       </w:r>
       <w:r>
         <w:rPr>
@@ -80,7 +98,16 @@
         <w:t>probe the live guardrail during generation and specialise to it</w:t>
       </w:r>
       <w:r>
-        <w:t xml:space="preserve">. We use this to build FORGE, a guardrail-adaptive attack search that scores against both a permissive public guardrail and a stricter one with a single submission. Along the way we identify two guardrail/predicate </w:t>
+        <w:t xml:space="preserve">. We use these to build FORGE, a guardrail-adaptive attack search that scores against both a permissive public guardrail and a stricter one with a single submission. Its dominant lever is </w:t>
+      </w:r>
+      <w:r>
+        <w:rPr>
+          <w:b/>
+        </w:rPr>
+        <w:t>density-packing</w:t>
+      </w:r>
+      <w:r>
+        <w:t xml:space="preserve">: because the per-candidate environment build is a fixed cost, packing up to ~128 exfiltration events into one candidate (message-spread × multi-hop batching) amortizes that cost and lifts the offline normalized score from ~45, for the naive one-event-per-candidate fill, toward the 1000 cap — chosen adaptively from a measured sample so it never regresses on a slow target. Along the way we identify two guardrail/predicate </w:t>
       </w:r>
       <w:r>
         <w:rPr>
@@ -1185,10 +1212,147 @@
         <w:rPr>
           <w:b/>
         </w:rPr>
-        <w:t>Concentrate and diversify.</w:t>
-      </w:r>
-      <w:r>
-        <w:t xml:space="preserve"> Because severity dominates and diversity is free per candidate (§3), FORGE fills the replay budget greedily by measured raw-per-hop, fanning the best route across distinct benign destinations so each candidate is a distinct cell. Untested variants are emitted on the strength of determinism (property 3).</w:t>
+        <w:t>Density-pack, then diversify.</w:t>
+      </w:r>
+      <w:r>
+        <w:t xml:space="preserve"> Two facts of the scoring/replay architecture combine into the dominant lever. First, severity stacks </w:t>
+      </w:r>
+      <w:r>
+        <w:rPr>
+          <w:i/>
+        </w:rPr>
+        <w:t>per tool event</w:t>
+      </w:r>
+      <w:r>
+        <w:t xml:space="preserve"> (§3, property 1): a trace with </w:t>
+      </w:r>
+      <w:r>
+        <w:rPr>
+          <w:i/>
+        </w:rPr>
+        <w:t>m</w:t>
+      </w:r>
+      <w:r>
+        <w:t xml:space="preserve"> secret-bearing posts scores 16</w:t>
+      </w:r>
+      <w:r>
+        <w:rPr>
+          <w:i/>
+        </w:rPr>
+        <w:t>m</w:t>
+      </w:r>
+      <w:r>
+        <w:t xml:space="preserve">, with no dedup. Second, the evaluator builds a </w:t>
+      </w:r>
+      <w:r>
+        <w:rPr>
+          <w:i/>
+        </w:rPr>
+        <w:t>fresh environment per candidate</w:t>
+      </w:r>
+      <w:r>
+        <w:t xml:space="preserve"> — parsing the multi-megabyte web/mail fixtures each time — so every candidate pays a fixed env-build overhead </w:t>
+      </w:r>
+      <w:r>
+        <w:rPr>
+          <w:i/>
+        </w:rPr>
+        <w:t>O</w:t>
+      </w:r>
+      <w:r>
+        <w:t xml:space="preserve"> (≈75 ms measured) once, regardless of how many scoring events it contains. It follows that the throughput-optimal candidate is not "one post to a fresh domain" (the naive fill, which pays </w:t>
+      </w:r>
+      <w:r>
+        <w:rPr>
+          <w:i/>
+        </w:rPr>
+        <w:t>O</w:t>
+      </w:r>
+      <w:r>
+        <w:t xml:space="preserve"> per single event and tops out near normalized-45) but a </w:t>
+      </w:r>
+      <w:r>
+        <w:rPr>
+          <w:b/>
+        </w:rPr>
+        <w:t>hybrid density-pack</w:t>
+      </w:r>
+      <w:r>
+        <w:t xml:space="preserve">: up to </w:t>
+      </w:r>
+      <w:r>
+        <w:rPr>
+          <w:rFonts w:ascii="Consolas" w:hAnsi="Consolas"/>
+          <w:sz w:val="19"/>
+        </w:rPr>
+        <w:t>MAX_MESSAGES_PER_CANDIDATE</w:t>
+      </w:r>
+      <w:r>
+        <w:t xml:space="preserve"> messages (32), each a multi-hop batch of </w:t>
+      </w:r>
+      <w:r>
+        <w:rPr>
+          <w:rFonts w:ascii="Consolas" w:hAnsi="Consolas"/>
+          <w:sz w:val="19"/>
+        </w:rPr>
+        <w:t>max_tool_hops</w:t>
+      </w:r>
+      <w:r>
+        <w:t xml:space="preserve"> posts (4), for up to </w:t>
+      </w:r>
+      <w:r>
+        <w:rPr>
+          <w:b/>
+        </w:rPr>
+        <w:t>128 `EXFILTRATION` events in one candidate</w:t>
+      </w:r>
+      <w:r>
+        <w:t xml:space="preserve"> — multi-hop batching keeps the per-post model-call cost low (one final turn amortizes four posts, versus one final turn per post when spreading one post per message), while the message-spread amortizes </w:t>
+      </w:r>
+      <w:r>
+        <w:rPr>
+          <w:i/>
+        </w:rPr>
+        <w:t>O</w:t>
+      </w:r>
+      <w:r>
+        <w:t xml:space="preserve"> over all 128 events. One such candidate scores ≈ 2050 raw for a single env build; the naive one scores 18. Whether the density-pack is worth it depends on the target's per-hop latency </w:t>
+      </w:r>
+      <w:r>
+        <w:rPr>
+          <w:i/>
+        </w:rPr>
+        <w:t>L</w:t>
+      </w:r>
+      <w:r>
+        <w:t xml:space="preserve"> relative to </w:t>
+      </w:r>
+      <w:r>
+        <w:rPr>
+          <w:i/>
+        </w:rPr>
+        <w:t>O</w:t>
+      </w:r>
+      <w:r>
+        <w:t xml:space="preserve"> (at large </w:t>
+      </w:r>
+      <w:r>
+        <w:rPr>
+          <w:i/>
+        </w:rPr>
+        <w:t>L</w:t>
+      </w:r>
+      <w:r>
+        <w:t xml:space="preserve"> the env build is negligible and packing only concentrates cost), so FORGE does not assume it: it </w:t>
+      </w:r>
+      <w:r>
+        <w:rPr>
+          <w:b/>
+        </w:rPr>
+        <w:t>measures a dense sample on the live target during generation</w:t>
+      </w:r>
+      <w:r>
+        <w:t xml:space="preserve"> — capturing the true per-message cost and confirming sustained compliance — and switches to dense only when the measured raw-per-replay-second beats the incumbent best route, sizing the returned list from that measurement so replay stays inside its deadline. On a fast target this lifts the normalized score from ~45 (naive fill) to the 1000 cap; on a slow target it correctly falls back to the wide fill (no regression). Remaining budget fans the best routes across distinct benign destinations (each a distinct cell, +2) and emits untested variants on the strength of determinism (property 3).</w:t>
       </w:r>
     </w:p>
     <w:p>
@@ -1245,7 +1409,7 @@
         <w:t>SECRET_MARKER</w:t>
       </w:r>
       <w:r>
-        <w:t xml:space="preserve"> sentinel post and free diversity via distinct destination </w:t>
+        <w:t xml:space="preserve"> sentinel post, the density-packing of §5, and diversity via distinct destination </w:t>
       </w:r>
       <w:r>
         <w:rPr>
@@ -1263,7 +1427,7 @@
         <w:t>benchmark-exploitation</w:t>
       </w:r>
       <w:r>
-        <w:t>: they score the public column, but posting an opaque token to a benign URL is not a real compromise and "distinct destination ≠ distinct attack." The read-</w:t>
+        <w:t xml:space="preserve">: they maximise the metric — posting an opaque token (or many) to benign URLs is not a real compromise, and "distinct destination ≠ distinct attack." The routes that read the real </w:t>
       </w:r>
       <w:r>
         <w:rPr>
@@ -1273,102 +1437,121 @@
         <w:t>secret.txt</w:t>
       </w:r>
       <w:r>
-        <w:t xml:space="preserve">-then-forward and untrusted-content-then-act routes are </w:t>
+        <w:t xml:space="preserve"> and forward its true values are </w:t>
       </w:r>
       <w:r>
         <w:rPr>
           <w:i/>
         </w:rPr>
-        <w:t>genuine compromises</w:t>
-      </w:r>
-      <w:r>
-        <w:t>. We present the sentinel route as metric-optimisation, not as the security headline (§8.5).</w:t>
-      </w:r>
-    </w:p>
-    <w:p>
+        <w:t>security-relevant</w:t>
+      </w:r>
+      <w:r>
+        <w:t xml:space="preserve">: a real secret leaves (§8.4). We are careful not to overclaim the latter as </w:t>
+      </w:r>
       <w:r>
         <w:rPr>
-          <w:b/>
+          <w:i/>
         </w:rPr>
-        <w:t>Beyond fixed routes: an online Go-Explore search.</w:t>
-      </w:r>
-      <w:r>
-        <w:t xml:space="preserve"> FORGE's default probe-then-fan search can only fan out routes it was written to try. We therefore also implement, in the same </w:t>
+        <w:t>indirect prompt injection</w:t>
+      </w:r>
+      <w:r>
+        <w:t xml:space="preserve"> — under a compliant stand-in the agent follows the </w:t>
+      </w:r>
+      <w:r>
+        <w:rPr>
+          <w:i/>
+        </w:rPr>
+        <w:t>user's</w:t>
+      </w:r>
+      <w:r>
+        <w:t xml:space="preserve"> instruction, not any injected content, so the untrusted read only supplies the provenance tag </w:t>
       </w:r>
       <w:r>
         <w:rPr>
           <w:rFonts w:ascii="Consolas" w:hAnsi="Consolas"/>
           <w:sz w:val="19"/>
         </w:rPr>
-        <w:t>attack.py</w:t>
-      </w:r>
-      <w:r>
-        <w:t xml:space="preserve">, an online </w:t>
-      </w:r>
+        <w:t>UNTRUSTED_TO_ACTION</w:t>
+      </w:r>
+      <w:r>
+        <w:t xml:space="preserve"> scores on; demonstrating injection-</w:t>
+      </w:r>
+      <w:r>
+        <w:rPr>
+          <w:i/>
+        </w:rPr>
+        <w:t>following</w:t>
+      </w:r>
+      <w:r>
+        <w:t xml:space="preserve"> would require a target that acts on tool-output content, which both public guardrails correctly taint-block. We present the metric-optimisation routes as exactly that, not as the security headline (§8.4).</w:t>
+      </w:r>
+    </w:p>
+    <w:p>
       <w:r>
         <w:rPr>
           <w:b/>
         </w:rPr>
-        <w:t>Go-Explore / quality-diversity search</w:t>
-      </w:r>
-      <w:r>
-        <w:t xml:space="preserve"> (</w:t>
+        <w:t>Budget-safety is the constraint, not the search.</w:t>
+      </w:r>
+      <w:r>
+        <w:t xml:space="preserve"> The SDK ships a Go-Explore attacker (</w:t>
       </w:r>
       <w:r>
         <w:rPr>
           <w:rFonts w:ascii="Consolas" w:hAnsi="Consolas"/>
           <w:sz w:val="19"/>
         </w:rPr>
-        <w:t>mode="explore"</w:t>
-      </w:r>
-      <w:r>
-        <w:t xml:space="preserve">) that uses the live target model as its fitness oracle: it keeps an archive keyed by the SDK's score-cell, </w:t>
+        <w:t>attacker_goexplore.py</w:t>
+      </w:r>
+      <w:r>
+        <w:t xml:space="preserve"> [4]) that returns to promising cells via snapshot/restore and explores a mutation grammar. We do not re-implement it; instead we isolate what actually matters for a </w:t>
       </w:r>
       <w:r>
         <w:rPr>
           <w:i/>
         </w:rPr>
-        <w:t>returns</w:t>
-      </w:r>
-      <w:r>
-        <w:t xml:space="preserve"> to a promising cell via </w:t>
+        <w:t>replay-scored</w:t>
+      </w:r>
+      <w:r>
+        <w:t xml:space="preserve"> setting. In </w:t>
       </w:r>
       <w:r>
         <w:rPr>
           <w:rFonts w:ascii="Consolas" w:hAnsi="Consolas"/>
           <w:sz w:val="19"/>
         </w:rPr>
-        <w:t>env.restore(snapshot)</w:t>
-      </w:r>
-      <w:r>
-        <w:t xml:space="preserve"> and then </w:t>
+        <w:t>experiments/goexplore_budget_safety.py</w:t>
+      </w:r>
+      <w:r>
+        <w:t xml:space="preserve"> we run the shipped baseline under the evaluator's own generation-deadline guard and show two defects: on a slow target it overruns the deadline — a </w:t>
+      </w:r>
+      <w:r>
+        <w:rPr>
+          <w:rFonts w:ascii="Consolas" w:hAnsi="Consolas"/>
+          <w:sz w:val="19"/>
+        </w:rPr>
+        <w:t>TimeoutError</w:t>
+      </w:r>
+      <w:r>
+        <w:t xml:space="preserve"> that </w:t>
+      </w:r>
+      <w:r>
+        <w:rPr>
+          <w:b/>
+        </w:rPr>
+        <w:t>zeroes the entire run</w:t>
+      </w:r>
+      <w:r>
+        <w:t xml:space="preserve"> — because its loop never forecasts whether the next interaction can finish in time; and it retains a full environment snapshot per novel cell with no eviction (≈1.7 MiB each, measured; ≈1.2 GiB at the interaction cap; its own source flags this). FORGE's per-interaction budget guard refuses work that cannot finish, and it retains no snapshots. The lesson generalises past this benchmark: for any attack generator scored by bounded replay, </w:t>
       </w:r>
       <w:r>
         <w:rPr>
           <w:i/>
         </w:rPr>
-        <w:t>explores</w:t>
-      </w:r>
-      <w:r>
-        <w:t xml:space="preserve"> by appending one move from a mutation grammar (read/open/email/post/post-what-you-read/send/shell/follow-injection), rewarding predicate severity, cell novelty, and a real-attack bonus. This is a faithful instance of the family FORGE's baseline only gestures at [4]. It discovers, rather than assumes, what fires on a specific target. In the offline ablation it grows a ~400–500 cell archive and finds 15 (public) to ~270 (strict) firing multi-step chains; because it </w:t>
-      </w:r>
-      <w:r>
-        <w:rPr>
-          <w:i/>
-        </w:rPr>
-        <w:t>explores</w:t>
-      </w:r>
-      <w:r>
-        <w:t xml:space="preserve"> rather than </w:t>
-      </w:r>
-      <w:r>
-        <w:rPr>
-          <w:i/>
-        </w:rPr>
-        <w:t>exploits</w:t>
-      </w:r>
-      <w:r>
-        <w:t>, its raw score is below FORGE's fan-out on the mock — the value is discovery on an unknown target, with the explore-then-fan-out hybrid the natural combination (and FORGE's probe-then-fan its route-level special case).</w:t>
+        <w:t>budget-safety is a first-class correctness constraint</w:t>
+      </w:r>
+      <w:r>
+        <w:t>, and a search heuristic that ignores it can score zero on exactly the slow targets where careful search would matter most.</w:t>
       </w:r>
     </w:p>
     <w:p>
@@ -1563,7 +1746,25 @@
     </w:p>
     <w:p>
       <w:r>
-        <w:t>Table 1 reports offline scores at a 60-second budget — far below the competition's per-model budget (the SDK's default attack budget is 1800 s), so these are mechanism checks, not leaderboard estimates. They show the mechanism fires and adapts: on the permissive public guardrail the sentinel/batch routes dominate; on the strict baseline the score comes from the read-secret and untrusted-to-action routes; a target that refuses overt-exfil wording is still driven to score via a benign framing the probe discovers; and both a fully refusing target and the SDK's own deterministic agent yield zero without crashing.</w:t>
+        <w:t xml:space="preserve">Table 1 reports an offline density-packing ablation (dense vs. wide fill) at a 30-second budget against near-zero-latency stand-ins, so these show the density-packing </w:t>
+      </w:r>
+      <w:r>
+        <w:rPr>
+          <w:i/>
+        </w:rPr>
+        <w:t>ceiling</w:t>
+      </w:r>
+      <w:r>
+        <w:t xml:space="preserve">, not leaderboard estimates (the real lift is latency-bound, §9). Every row is budget-safe (replay &lt; budget, else the run is zeroed). They show: density-packing lifts the public-column normalized score ~15× from 45.2 (wide) to 677.8 at 30 s and to the 1000 cap by 60 s; on the strict baseline the marker post is blocked so dense correctly does </w:t>
+      </w:r>
+      <w:r>
+        <w:rPr>
+          <w:i/>
+        </w:rPr>
+        <w:t>not</w:t>
+      </w:r>
+      <w:r>
+        <w:t xml:space="preserve"> engage and FORGE falls back to the read-secret/untrusted-to-action routes; on a slow target the adaptive measured-throughput rule keeps the wide fill (an exact tie — no regression); a parser that rejects multi-call batches drops density to one post per message (norm 12 → 203); and both a fully refusing target and the SDK's own deterministic agent yield zero without crashing.</w:t>
       </w:r>
     </w:p>
     <w:p>
@@ -1571,7 +1772,7 @@
         <w:rPr>
           <w:b/>
         </w:rPr>
-        <w:t>Table 1 — Mechanism validation (deterministic stand-in targets, 60 s budget).</w:t>
+        <w:t>Table 1 — Density-packing ablation (deterministic stand-in targets, 30 s budget).</w:t>
       </w:r>
       <w:r>
         <w:t xml:space="preserve"> </w:t>
@@ -1580,7 +1781,7 @@
         <w:rPr>
           <w:i/>
         </w:rPr>
-        <w:t>Not real-model scores; they validate the scoring mechanism and FORGE's adaptivity, budget safety, and graceful degradation.</w:t>
+        <w:t>Not real-model scores; they show the mechanism's ceiling on a fast target and its adaptive fallback, budget safety, and graceful degradation. `results/dense_ablation.json`; `verify.py` check 1.</w:t>
       </w:r>
     </w:p>
     <w:tbl>
@@ -1590,16 +1791,17 @@
         <w:tblLook w:firstColumn="1" w:firstRow="1" w:lastColumn="0" w:lastRow="0" w:noHBand="0" w:noVBand="1" w:val="04A0"/>
       </w:tblPr>
       <w:tblGrid>
-        <w:gridCol w:w="1728"/>
-        <w:gridCol w:w="1728"/>
-        <w:gridCol w:w="1728"/>
-        <w:gridCol w:w="1728"/>
-        <w:gridCol w:w="1728"/>
+        <w:gridCol w:w="1440"/>
+        <w:gridCol w:w="1440"/>
+        <w:gridCol w:w="1440"/>
+        <w:gridCol w:w="1440"/>
+        <w:gridCol w:w="1440"/>
+        <w:gridCol w:w="1440"/>
       </w:tblGrid>
       <w:tr>
         <w:tc>
           <w:tcPr>
-            <w:tcW w:type="dxa" w:w="1728"/>
+            <w:tcW w:type="dxa" w:w="1440"/>
           </w:tcPr>
           <w:p>
             <w:r>
@@ -1617,7 +1819,7 @@
         </w:tc>
         <w:tc>
           <w:tcPr>
-            <w:tcW w:type="dxa" w:w="1728"/>
+            <w:tcW w:type="dxa" w:w="1440"/>
           </w:tcPr>
           <w:p>
             <w:r>
@@ -1635,7 +1837,7 @@
         </w:tc>
         <w:tc>
           <w:tcPr>
-            <w:tcW w:type="dxa" w:w="1728"/>
+            <w:tcW w:type="dxa" w:w="1440"/>
           </w:tcPr>
           <w:p>
             <w:r>
@@ -1647,13 +1849,13 @@
               <w:rPr>
                 <w:b/>
               </w:rPr>
-              <w:t>raw</w:t>
+              <w:t>wide (norm)</w:t>
             </w:r>
           </w:p>
         </w:tc>
         <w:tc>
           <w:tcPr>
-            <w:tcW w:type="dxa" w:w="1728"/>
+            <w:tcW w:type="dxa" w:w="1440"/>
           </w:tcPr>
           <w:p>
             <w:r>
@@ -1665,13 +1867,13 @@
               <w:rPr>
                 <w:b/>
               </w:rPr>
-              <w:t>norm</w:t>
+              <w:t>dense (norm)</w:t>
             </w:r>
           </w:p>
         </w:tc>
         <w:tc>
           <w:tcPr>
-            <w:tcW w:type="dxa" w:w="1728"/>
+            <w:tcW w:type="dxa" w:w="1440"/>
           </w:tcPr>
           <w:p>
             <w:r>
@@ -1683,7 +1885,25 @@
               <w:rPr>
                 <w:b/>
               </w:rPr>
-              <w:t>predicates (count)</w:t>
+              <w:t>posts/cand</w:t>
+            </w:r>
+          </w:p>
+        </w:tc>
+        <w:tc>
+          <w:tcPr>
+            <w:tcW w:type="dxa" w:w="1440"/>
+          </w:tcPr>
+          <w:p>
+            <w:r>
+              <w:rPr>
+                <w:b/>
+              </w:rPr>
+            </w:r>
+            <w:r>
+              <w:rPr>
+                <w:b/>
+              </w:rPr>
+              <w:t>budget-safe</w:t>
             </w:r>
           </w:p>
         </w:tc>
@@ -1691,7 +1911,7 @@
       <w:tr>
         <w:tc>
           <w:tcPr>
-            <w:tcW w:type="dxa" w:w="1728"/>
+            <w:tcW w:type="dxa" w:w="1440"/>
           </w:tcPr>
           <w:p>
             <w:r/>
@@ -1702,7 +1922,7 @@
         </w:tc>
         <w:tc>
           <w:tcPr>
-            <w:tcW w:type="dxa" w:w="1728"/>
+            <w:tcW w:type="dxa" w:w="1440"/>
           </w:tcPr>
           <w:p>
             <w:r/>
@@ -1713,34 +1933,51 @@
         </w:tc>
         <w:tc>
           <w:tcPr>
-            <w:tcW w:type="dxa" w:w="1728"/>
+            <w:tcW w:type="dxa" w:w="1440"/>
           </w:tcPr>
           <w:p>
             <w:r/>
             <w:r>
-              <w:t>17892</w:t>
+              <w:t>45.2</w:t>
             </w:r>
           </w:p>
         </w:tc>
         <w:tc>
           <w:tcPr>
-            <w:tcW w:type="dxa" w:w="1728"/>
+            <w:tcW w:type="dxa" w:w="1440"/>
           </w:tcPr>
           <w:p>
             <w:r/>
             <w:r>
-              <w:t>89.5</w:t>
+              <w:rPr>
+                <w:b/>
+              </w:rPr>
+              <w:t>677.8</w:t>
+            </w:r>
+            <w:r>
+              <w:t xml:space="preserve"> (→1000 @60 s)</w:t>
             </w:r>
           </w:p>
         </w:tc>
         <w:tc>
           <w:tcPr>
-            <w:tcW w:type="dxa" w:w="1728"/>
+            <w:tcW w:type="dxa" w:w="1440"/>
           </w:tcPr>
           <w:p>
             <w:r/>
             <w:r>
-              <w:t>EXFIL 1074, DEPUTY 23</w:t>
+              <w:t>128</w:t>
+            </w:r>
+          </w:p>
+        </w:tc>
+        <w:tc>
+          <w:tcPr>
+            <w:tcW w:type="dxa" w:w="1440"/>
+          </w:tcPr>
+          <w:p>
+            <w:r/>
+            <w:r>
+              <w:t>✅</w:t>
             </w:r>
           </w:p>
         </w:tc>
@@ -1748,7 +1985,78 @@
       <w:tr>
         <w:tc>
           <w:tcPr>
-            <w:tcW w:type="dxa" w:w="1728"/>
+            <w:tcW w:type="dxa" w:w="1440"/>
+          </w:tcPr>
+          <w:p>
+            <w:r/>
+            <w:r>
+              <w:t>stubborn (refuses overt exfil)</w:t>
+            </w:r>
+          </w:p>
+        </w:tc>
+        <w:tc>
+          <w:tcPr>
+            <w:tcW w:type="dxa" w:w="1440"/>
+          </w:tcPr>
+          <w:p>
+            <w:r/>
+            <w:r>
+              <w:t>public</w:t>
+            </w:r>
+          </w:p>
+        </w:tc>
+        <w:tc>
+          <w:tcPr>
+            <w:tcW w:type="dxa" w:w="1440"/>
+          </w:tcPr>
+          <w:p>
+            <w:r/>
+            <w:r>
+              <w:t>45.2</w:t>
+            </w:r>
+          </w:p>
+        </w:tc>
+        <w:tc>
+          <w:tcPr>
+            <w:tcW w:type="dxa" w:w="1440"/>
+          </w:tcPr>
+          <w:p>
+            <w:r/>
+            <w:r>
+              <w:rPr>
+                <w:b/>
+              </w:rPr>
+              <w:t>677.8</w:t>
+            </w:r>
+          </w:p>
+        </w:tc>
+        <w:tc>
+          <w:tcPr>
+            <w:tcW w:type="dxa" w:w="1440"/>
+          </w:tcPr>
+          <w:p>
+            <w:r/>
+            <w:r>
+              <w:t>128</w:t>
+            </w:r>
+          </w:p>
+        </w:tc>
+        <w:tc>
+          <w:tcPr>
+            <w:tcW w:type="dxa" w:w="1440"/>
+          </w:tcPr>
+          <w:p>
+            <w:r/>
+            <w:r>
+              <w:t>✅</w:t>
+            </w:r>
+          </w:p>
+        </w:tc>
+      </w:tr>
+      <w:tr>
+        <w:tc>
+          <w:tcPr>
+            <w:tcW w:type="dxa" w:w="1440"/>
           </w:tcPr>
           <w:p>
             <w:r/>
@@ -1759,7 +2067,7 @@
         </w:tc>
         <w:tc>
           <w:tcPr>
-            <w:tcW w:type="dxa" w:w="1728"/>
+            <w:tcW w:type="dxa" w:w="1440"/>
           </w:tcPr>
           <w:p>
             <w:r/>
@@ -1770,34 +2078,45 @@
         </w:tc>
         <w:tc>
           <w:tcPr>
-            <w:tcW w:type="dxa" w:w="1728"/>
+            <w:tcW w:type="dxa" w:w="1440"/>
           </w:tcPr>
           <w:p>
             <w:r/>
             <w:r>
-              <w:t>9606</w:t>
+              <w:t>24.2</w:t>
             </w:r>
           </w:p>
         </w:tc>
         <w:tc>
           <w:tcPr>
-            <w:tcW w:type="dxa" w:w="1728"/>
+            <w:tcW w:type="dxa" w:w="1440"/>
           </w:tcPr>
           <w:p>
             <w:r/>
             <w:r>
-              <w:t>48.0</w:t>
+              <w:t>24.2 (dense N/A)</w:t>
             </w:r>
           </w:p>
         </w:tc>
         <w:tc>
           <w:tcPr>
-            <w:tcW w:type="dxa" w:w="1728"/>
+            <w:tcW w:type="dxa" w:w="1440"/>
           </w:tcPr>
           <w:p>
             <w:r/>
             <w:r>
-              <w:t>UNTRUSTED 528, EXFIL 30, DEPUTY 15</w:t>
+              <w:t>1</w:t>
+            </w:r>
+          </w:p>
+        </w:tc>
+        <w:tc>
+          <w:tcPr>
+            <w:tcW w:type="dxa" w:w="1440"/>
+          </w:tcPr>
+          <w:p>
+            <w:r/>
+            <w:r>
+              <w:t>✅</w:t>
             </w:r>
           </w:p>
         </w:tc>
@@ -1805,18 +2124,18 @@
       <w:tr>
         <w:tc>
           <w:tcPr>
-            <w:tcW w:type="dxa" w:w="1728"/>
+            <w:tcW w:type="dxa" w:w="1440"/>
           </w:tcPr>
           <w:p>
             <w:r/>
             <w:r>
-              <w:t>stubborn (refuses overt exfil)</w:t>
+              <w:t>slow target (~120 ms/hop)</w:t>
             </w:r>
           </w:p>
         </w:tc>
         <w:tc>
           <w:tcPr>
-            <w:tcW w:type="dxa" w:w="1728"/>
+            <w:tcW w:type="dxa" w:w="1440"/>
           </w:tcPr>
           <w:p>
             <w:r/>
@@ -1827,34 +2146,51 @@
         </w:tc>
         <w:tc>
           <w:tcPr>
-            <w:tcW w:type="dxa" w:w="1728"/>
+            <w:tcW w:type="dxa" w:w="1440"/>
           </w:tcPr>
           <w:p>
             <w:r/>
             <w:r>
-              <w:t>17958</w:t>
+              <w:t>9.6</w:t>
             </w:r>
           </w:p>
         </w:tc>
         <w:tc>
           <w:tcPr>
-            <w:tcW w:type="dxa" w:w="1728"/>
+            <w:tcW w:type="dxa" w:w="1440"/>
           </w:tcPr>
           <w:p>
             <w:r/>
             <w:r>
-              <w:t>89.8</w:t>
+              <w:rPr>
+                <w:b/>
+              </w:rPr>
+              <w:t>9.6</w:t>
+            </w:r>
+            <w:r>
+              <w:t xml:space="preserve"> (dense falls back → exact tie)</w:t>
             </w:r>
           </w:p>
         </w:tc>
         <w:tc>
           <w:tcPr>
-            <w:tcW w:type="dxa" w:w="1728"/>
+            <w:tcW w:type="dxa" w:w="1440"/>
           </w:tcPr>
           <w:p>
             <w:r/>
             <w:r>
-              <w:t>EXFIL 1078, DEPUTY 23</w:t>
+              <w:t>1</w:t>
+            </w:r>
+          </w:p>
+        </w:tc>
+        <w:tc>
+          <w:tcPr>
+            <w:tcW w:type="dxa" w:w="1440"/>
+          </w:tcPr>
+          <w:p>
+            <w:r/>
+            <w:r>
+              <w:t>✅</w:t>
             </w:r>
           </w:p>
         </w:tc>
@@ -1862,7 +2198,7 @@
       <w:tr>
         <w:tc>
           <w:tcPr>
-            <w:tcW w:type="dxa" w:w="1728"/>
+            <w:tcW w:type="dxa" w:w="1440"/>
           </w:tcPr>
           <w:p>
             <w:r/>
@@ -1873,7 +2209,7 @@
         </w:tc>
         <w:tc>
           <w:tcPr>
-            <w:tcW w:type="dxa" w:w="1728"/>
+            <w:tcW w:type="dxa" w:w="1440"/>
           </w:tcPr>
           <w:p>
             <w:r/>
@@ -1884,34 +2220,51 @@
         </w:tc>
         <w:tc>
           <w:tcPr>
-            <w:tcW w:type="dxa" w:w="1728"/>
+            <w:tcW w:type="dxa" w:w="1440"/>
           </w:tcPr>
           <w:p>
             <w:r/>
             <w:r>
-              <w:t>4848</w:t>
+              <w:t>12.0</w:t>
             </w:r>
           </w:p>
         </w:tc>
         <w:tc>
           <w:tcPr>
-            <w:tcW w:type="dxa" w:w="1728"/>
+            <w:tcW w:type="dxa" w:w="1440"/>
           </w:tcPr>
           <w:p>
             <w:r/>
             <w:r>
-              <w:t>24.2</w:t>
+              <w:rPr>
+                <w:b/>
+              </w:rPr>
+              <w:t>203.4</w:t>
+            </w:r>
+            <w:r>
+              <w:t xml:space="preserve"> (density adapts to 32)</w:t>
             </w:r>
           </w:p>
         </w:tc>
         <w:tc>
           <w:tcPr>
-            <w:tcW w:type="dxa" w:w="1728"/>
+            <w:tcW w:type="dxa" w:w="1440"/>
           </w:tcPr>
           <w:p>
             <w:r/>
             <w:r>
-              <w:t>EXFIL 254, DEPUTY 46</w:t>
+              <w:t>32</w:t>
+            </w:r>
+          </w:p>
+        </w:tc>
+        <w:tc>
+          <w:tcPr>
+            <w:tcW w:type="dxa" w:w="1440"/>
+          </w:tcPr>
+          <w:p>
+            <w:r/>
+            <w:r>
+              <w:t>✅</w:t>
             </w:r>
           </w:p>
         </w:tc>
@@ -1919,7 +2272,7 @@
       <w:tr>
         <w:tc>
           <w:tcPr>
-            <w:tcW w:type="dxa" w:w="1728"/>
+            <w:tcW w:type="dxa" w:w="1440"/>
           </w:tcPr>
           <w:p>
             <w:r/>
@@ -1930,7 +2283,7 @@
         </w:tc>
         <w:tc>
           <w:tcPr>
-            <w:tcW w:type="dxa" w:w="1728"/>
+            <w:tcW w:type="dxa" w:w="1440"/>
           </w:tcPr>
           <w:p>
             <w:r/>
@@ -1941,7 +2294,7 @@
         </w:tc>
         <w:tc>
           <w:tcPr>
-            <w:tcW w:type="dxa" w:w="1728"/>
+            <w:tcW w:type="dxa" w:w="1440"/>
           </w:tcPr>
           <w:p>
             <w:r/>
@@ -1952,80 +2305,34 @@
         </w:tc>
         <w:tc>
           <w:tcPr>
-            <w:tcW w:type="dxa" w:w="1728"/>
+            <w:tcW w:type="dxa" w:w="1440"/>
           </w:tcPr>
           <w:p>
             <w:r/>
             <w:r>
-              <w:t>0</w:t>
+              <w:t>0 (no crash)</w:t>
             </w:r>
           </w:p>
         </w:tc>
         <w:tc>
           <w:tcPr>
-            <w:tcW w:type="dxa" w:w="1728"/>
+            <w:tcW w:type="dxa" w:w="1440"/>
           </w:tcPr>
           <w:p>
             <w:r/>
             <w:r>
-              <w:t>— (no crash)</w:t>
-            </w:r>
-          </w:p>
-        </w:tc>
-      </w:tr>
-      <w:tr>
-        <w:tc>
-          <w:tcPr>
-            <w:tcW w:type="dxa" w:w="1728"/>
-          </w:tcPr>
-          <w:p>
-            <w:r/>
-            <w:r>
-              <w:t>SDK deterministic agent</w:t>
+              <w:t>1</w:t>
             </w:r>
           </w:p>
         </w:tc>
         <w:tc>
           <w:tcPr>
-            <w:tcW w:type="dxa" w:w="1728"/>
+            <w:tcW w:type="dxa" w:w="1440"/>
           </w:tcPr>
           <w:p>
             <w:r/>
             <w:r>
-              <w:t>public</w:t>
-            </w:r>
-          </w:p>
-        </w:tc>
-        <w:tc>
-          <w:tcPr>
-            <w:tcW w:type="dxa" w:w="1728"/>
-          </w:tcPr>
-          <w:p>
-            <w:r/>
-            <w:r>
-              <w:t>0</w:t>
-            </w:r>
-          </w:p>
-        </w:tc>
-        <w:tc>
-          <w:tcPr>
-            <w:tcW w:type="dxa" w:w="1728"/>
-          </w:tcPr>
-          <w:p>
-            <w:r/>
-            <w:r>
-              <w:t>0</w:t>
-            </w:r>
-          </w:p>
-        </w:tc>
-        <w:tc>
-          <w:tcPr>
-            <w:tcW w:type="dxa" w:w="1728"/>
-          </w:tcPr>
-          <w:p>
-            <w:r/>
-            <w:r>
-              <w:t>— (by construction)</w:t>
+              <w:t>✅</w:t>
             </w:r>
           </w:p>
         </w:tc>
@@ -2310,12 +2617,12 @@
         <w:pStyle w:val="Heading2"/>
       </w:pPr>
       <w:r>
-        <w:t>8.4 A genuine multi-step compromise, and what the guardrails do with it</w:t>
+        <w:t>8.4 A real secret leaving: the guardrail differential on a user-instructed read-then-exfil</w:t>
       </w:r>
     </w:p>
     <w:p>
       <w:r>
-        <w:t xml:space="preserve">The security headline is not the sentinel route but a real chain: an agent consults untrusted web content, reads the protected </w:t>
+        <w:t xml:space="preserve">A second, security-relevant chain drives the point home: a user instructs the agent to open a web page, read the protected </w:t>
       </w:r>
       <w:r>
         <w:rPr>
@@ -2325,7 +2632,7 @@
         <w:t>secret.txt</w:t>
       </w:r>
       <w:r>
-        <w:t xml:space="preserve">, and exfiltrates its </w:t>
+        <w:t xml:space="preserve">, and post its </w:t>
       </w:r>
       <w:r>
         <w:rPr>
@@ -2334,16 +2641,16 @@
         <w:t>real</w:t>
       </w:r>
       <w:r>
-        <w:t xml:space="preserve"> credential values. The contrast across guardrails </w:t>
+        <w:t xml:space="preserve"> credential values to an external endpoint. Whether the </w:t>
       </w:r>
       <w:r>
         <w:rPr>
           <w:i/>
         </w:rPr>
-        <w:t>is</w:t>
-      </w:r>
-      <w:r>
-        <w:t xml:space="preserve"> the finding (</w:t>
+        <w:t>real</w:t>
+      </w:r>
+      <w:r>
+        <w:t xml:space="preserve"> secret leaves depends entirely on the guardrail (</w:t>
       </w:r>
       <w:r>
         <w:rPr>
@@ -2661,16 +2968,119 @@
     <w:p/>
     <w:p>
       <w:r>
-        <w:t xml:space="preserve">The </w:t>
-      </w:r>
-      <w:r>
         <w:rPr>
           <w:b/>
         </w:rPr>
-        <w:t>public guardrail correctly defends the canonical indirect-prompt-injection attack</w:t>
-      </w:r>
-      <w:r>
-        <w:t xml:space="preserve"> — which is precisely why the only public-scorable route is the sentinel data-channel gap — and the genuine compromise leaks only through the strict baseline's "post"-keyword mismatch (Bug 2, §4.2), which our reference guardrail closes. This is the durable security content of the work.</w:t>
+        <w:t>What this is, precisely.</w:t>
+      </w:r>
+      <w:r>
+        <w:t xml:space="preserve"> The compliant stand-in follows the </w:t>
+      </w:r>
+      <w:r>
+        <w:rPr>
+          <w:i/>
+        </w:rPr>
+        <w:t>user's</w:t>
+      </w:r>
+      <w:r>
+        <w:t xml:space="preserve"> instructions — it posts to the user-supplied URL, not to any address written in </w:t>
+      </w:r>
+      <w:r>
+        <w:rPr>
+          <w:rFonts w:ascii="Consolas" w:hAnsi="Consolas"/>
+          <w:sz w:val="19"/>
+        </w:rPr>
+        <w:t>page_2</w:t>
+      </w:r>
+      <w:r>
+        <w:t xml:space="preserve"> — so this is </w:t>
+      </w:r>
+      <w:r>
+        <w:rPr>
+          <w:b/>
+        </w:rPr>
+        <w:t>user-instructed read-then-exfil, not indirect prompt injection</w:t>
+      </w:r>
+      <w:r>
+        <w:t xml:space="preserve">: the </w:t>
+      </w:r>
+      <w:r>
+        <w:rPr>
+          <w:rFonts w:ascii="Consolas" w:hAnsi="Consolas"/>
+          <w:sz w:val="19"/>
+        </w:rPr>
+        <w:t>web.open</w:t>
+      </w:r>
+      <w:r>
+        <w:t xml:space="preserve"> is causally inert here (it only sets the untrusted-provenance tag that lets </w:t>
+      </w:r>
+      <w:r>
+        <w:rPr>
+          <w:rFonts w:ascii="Consolas" w:hAnsi="Consolas"/>
+          <w:sz w:val="19"/>
+        </w:rPr>
+        <w:t>UNTRUSTED_TO_ACTION</w:t>
+      </w:r>
+      <w:r>
+        <w:t xml:space="preserve"> fire). We do not claim to demonstrate injection-following; both public guardrails in fact taint-block a post that follows an untrusted read, which is the correct defense against injection. The stacked predicates (severity 5 + 5 = 32 raw) accumulate </w:t>
+      </w:r>
+      <w:r>
+        <w:rPr>
+          <w:b/>
+        </w:rPr>
+        <w:t>over the three-message chain</w:t>
+      </w:r>
+      <w:r>
+        <w:t>, not in a single interaction.</w:t>
+      </w:r>
+    </w:p>
+    <w:p>
+      <w:r>
+        <w:rPr>
+          <w:b/>
+        </w:rPr>
+        <w:t>Why the strict baseline leaks.</w:t>
+      </w:r>
+      <w:r>
+        <w:t xml:space="preserve"> Its untrusted→SHARE check keys on send/email/upload/</w:t>
+      </w:r>
+      <w:r>
+        <w:rPr>
+          <w:b/>
+        </w:rPr>
+        <w:t>post</w:t>
+      </w:r>
+      <w:r>
+        <w:t xml:space="preserve"> while the scorer's intent check keys only on send/email/upload, so the word "post" launders the action past the guardrail while the predicate still scores it (Bug 2, §4.2). Independently, the same baseline's exfiltration matcher only recognizes the </w:t>
+      </w:r>
+      <w:r>
+        <w:rPr>
+          <w:rFonts w:ascii="Consolas" w:hAnsi="Consolas"/>
+          <w:sz w:val="19"/>
+        </w:rPr>
+        <w:t>SECRET_MARKER</w:t>
+      </w:r>
+      <w:r>
+        <w:t xml:space="preserve"> sentinel, so even a </w:t>
+      </w:r>
+      <w:r>
+        <w:rPr>
+          <w:i/>
+        </w:rPr>
+        <w:t>benign-worded</w:t>
+      </w:r>
+      <w:r>
+        <w:t xml:space="preserve"> read-then-post with no untrusted taint leaks the real secret value the scorer flags — a second, distinct hole. Our reference guardrail closes both by tainting on the </w:t>
+      </w:r>
+      <w:r>
+        <w:rPr>
+          <w:rFonts w:ascii="Consolas" w:hAnsi="Consolas"/>
+          <w:sz w:val="19"/>
+        </w:rPr>
+        <w:t>secret.txt</w:t>
+      </w:r>
+      <w:r>
+        <w:t xml:space="preserve"> read and refusing subsequent egress regardless of wording. This guardrail differential, and the reference that erases it, is the durable security content of the work; the public-column sentinel route (§3, §4.1) is a separate, unrelated payload-channel gap and is labeled throughout as benchmark-exploitation.</w:t>
       </w:r>
     </w:p>
     <w:p>
@@ -2701,7 +3111,7 @@
         <w:t>off</w:t>
       </w:r>
       <w:r>
-        <w:t xml:space="preserve"> by default and we do not claim it improves our score. We report it as an honest negative and a generalisable component for settings where cells are genuinely </w:t>
+        <w:t xml:space="preserve"> by default and we do not claim it improves our score. Density-packing (§5) reduces its relevance further still: the throughput-optimal fill concentrates budget on a single dense exfiltration route, so there is even less cross-route diversity for a repulsion model to select over. We report the DPP as an honest negative and a generalisable component for settings where cells are genuinely </w:t>
       </w:r>
       <w:r>
         <w:rPr>
@@ -2752,7 +3162,34 @@
         <w:t>UNTRUSTED_TO_ACTION</w:t>
       </w:r>
       <w:r>
-        <w:t xml:space="preserve"> is reachable only on the strict baseline via Bug 2. (v) Offline budgets are short (60 s), far below the competition's per-model budget; they validate mechanism, not the real ceiling.</w:t>
+        <w:t xml:space="preserve"> is reachable only on the strict baseline via Bug 2. (v) Offline budgets validate mechanism, not the real ceiling. (vi) </w:t>
+      </w:r>
+      <w:r>
+        <w:rPr>
+          <w:b/>
+        </w:rPr>
+        <w:t>Density-packing is latency-bound.</w:t>
+      </w:r>
+      <w:r>
+        <w:t xml:space="preserve"> Its absolute lift depends on the real target's per-hop latency relative to the per-candidate env-build overhead: near the crossover (~0.5 s/hop) dense ties the wide fill, and above it the wide fill wins, so the norm-1000 figures here reflect a near-zero-latency stand-in, not a promised real-model score; the adaptive rule guarantees no regression but not the ceiling. (vii) </w:t>
+      </w:r>
+      <w:r>
+        <w:rPr>
+          <w:b/>
+        </w:rPr>
+        <w:t>Density-packing is compliance-bound and worst-case fragile in one candidate:</w:t>
+      </w:r>
+      <w:r>
+        <w:t xml:space="preserve"> it assumes the target sustains posting across a 32-message candidate; the probe re-checks and falls back, but a target that complies for the sample then refuses mid-candidate yields a shorter trace (still valid, lower-scoring). (viii) Density-packing exploits the </w:t>
+      </w:r>
+      <w:r>
+        <w:rPr>
+          <w:i/>
+        </w:rPr>
+        <w:t>intended</w:t>
+      </w:r>
+      <w:r>
+        <w:t xml:space="preserve"> per-event, no-dedup scoring, not a bug; we flag that scoring design to the organizers (§10) as one an attacker can run to the cap.</w:t>
       </w:r>
     </w:p>
     <w:p>
@@ -2765,7 +3202,25 @@
     </w:p>
     <w:p>
       <w:r>
-        <w:t>All experiments run in an offline, fixture-backed sandbox with synthetic secrets and mock egress tools; no real endpoint is contacted and no real secret exists. The attack routes are scoped to this benchmark's sentinel and fixtures and are not usable against deployed systems. The two guardrail mismatches (§4) concern the competition's public SDK; we will disclose them to the organizers before publication. We lead with the defensive contribution (§6) because it is the durable one. No competition data is redistributed here; we cite the public MIT-licensed SDK rather than re-hosting fixtures.</w:t>
+        <w:t xml:space="preserve">All experiments run in an offline, fixture-backed sandbox with synthetic secrets and mock egress tools; no real endpoint is contacted and no real secret exists. The attack routes are scoped to this benchmark's sentinel and fixtures and are not usable against deployed systems. Three findings concern the competition's </w:t>
+      </w:r>
+      <w:r>
+        <w:rPr>
+          <w:i/>
+        </w:rPr>
+        <w:t>public</w:t>
+      </w:r>
+      <w:r>
+        <w:t xml:space="preserve"> SDK and we will disclose all three to the organizers before publication: the two guardrail/predicate mismatches (§4), and a scoring observation — because raw score sums severity over </w:t>
+      </w:r>
+      <w:r>
+        <w:rPr>
+          <w:i/>
+        </w:rPr>
+        <w:t>every</w:t>
+      </w:r>
+      <w:r>
+        <w:t xml:space="preserve"> tool event with no dedup and normalizes by a fixed 200000, a density-packing attacker can drive the normalized score to its cap on a fast target (§5); we flag it not as a vulnerability but as a metric-design choice the organizers may wish to reconsider (e.g. per-trace or per-predicate-type caps). We lead with the defensive contribution (§6) because it is the durable one. No competition data is redistributed here; we cite the public MIT-licensed SDK rather than re-hosting fixtures.</w:t>
       </w:r>
     </w:p>
     <w:p>
@@ -2778,7 +3233,46 @@
     </w:p>
     <w:p>
       <w:r>
-        <w:t>Indirect prompt injection — untrusted content steering an integrated application [3] — is the threat this benchmark operationalises for tool-using agents; [2] reports insights from a large-scale public agent-security competition of the same lineage. FORGE's probe-then-exploit structure is an archive-guided search in the spirit of Go-Explore [4], specialised to a guardrail-conditioned, replay-deterministic setting. Our diversity study uses determinantal point processes [6] and their fast greedy MAP inference [5].</w:t>
+        <w:t xml:space="preserve">Indirect prompt injection — untrusted content steering an integrated application [3] — is the threat this benchmark operationalises for tool-using agents; [2] reports insights from a large-scale public agent-security competition of the same lineage. FORGE is </w:t>
+      </w:r>
+      <w:r>
+        <w:rPr>
+          <w:i/>
+        </w:rPr>
+        <w:t>not</w:t>
+      </w:r>
+      <w:r>
+        <w:t xml:space="preserve"> an archive-guided search: it is a probe-then-fan specialisation to whatever guardrail is live, plus the density-packing of §5. The SDK itself ships a Go-Explore attacker [4], </w:t>
+      </w:r>
+      <w:r>
+        <w:rPr>
+          <w:rFonts w:ascii="Consolas" w:hAnsi="Consolas"/>
+          <w:sz w:val="19"/>
+        </w:rPr>
+        <w:t>attacker_goexplore.py</w:t>
+      </w:r>
+      <w:r>
+        <w:t xml:space="preserve">, which restores cell states via snapshot/restore; we found (and reproduce in </w:t>
+      </w:r>
+      <w:r>
+        <w:rPr>
+          <w:rFonts w:ascii="Consolas" w:hAnsi="Consolas"/>
+          <w:sz w:val="19"/>
+        </w:rPr>
+        <w:t>experiments/goexplore_budget_safety.py</w:t>
+      </w:r>
+      <w:r>
+        <w:t xml:space="preserve">) that this shipped baseline can overrun the evaluator's generation deadline on a slow target — a </w:t>
+      </w:r>
+      <w:r>
+        <w:rPr>
+          <w:rFonts w:ascii="Consolas" w:hAnsi="Consolas"/>
+          <w:sz w:val="19"/>
+        </w:rPr>
+        <w:t>TimeoutError</w:t>
+      </w:r>
+      <w:r>
+        <w:t xml:space="preserve"> that zeroes the entire run — and retains a full environment snapshot per novel cell with no eviction (its own source flags the resulting unbounded memory), whereas FORGE's per-interaction budget guard refuses work that cannot finish and it retains no snapshots. Treating budget-safety as a first-class constraint, not the search heuristic, is what separates the two. Our diversity study uses determinantal point processes [6] and their fast greedy MAP inference [5].</w:t>
       </w:r>
     </w:p>
     <w:p>

</xml_diff>